<commit_message>
feat: implement Section 8 & Section 6 requirements (Admin protection, CBU currency rates, hero carousel, full countries, structured size, inline modals)
</commit_message>
<xml_diff>
--- a/TZ/ArtQala_TZ.docx
+++ b/TZ/ArtQala_TZ.docx
@@ -2437,46 +2437,401 @@
         <w:spacing w:after="200" w:before="400"/>
       </w:pPr>
       <w:r>
-        <w:t xml:space="preserve">8. Ishga tushirish tartibi (tavsiya)</w:t>
-      </w:r>
-    </w:p>
-    <w:p>
-      <w:pPr>
-        <w:pStyle w:val="ListParagraph"/>
-        <w:numPr>
-          <w:ilvl w:val="0"/>
-          <w:numId w:val="1"/>
-        </w:numPr>
-        <w:spacing w:after="80"/>
-      </w:pPr>
-      <w:r>
-        <w:t xml:space="preserve">1-bosqich: Kartinalar, rassomlar, kategoriyalar, galereya va kontakt sahifalari + admin panelning asosiy qismi.</w:t>
-      </w:r>
-    </w:p>
-    <w:p>
-      <w:pPr>
-        <w:pStyle w:val="ListParagraph"/>
-        <w:numPr>
-          <w:ilvl w:val="0"/>
-          <w:numId w:val="1"/>
-        </w:numPr>
-        <w:spacing w:after="80"/>
-      </w:pPr>
-      <w:r>
-        <w:t xml:space="preserve">2-bosqich: Ro'yxatdan o'tish, so'rov/buyurtma tizimi, narx-skidka tizimi.</w:t>
-      </w:r>
-    </w:p>
-    <w:p>
-      <w:pPr>
-        <w:pStyle w:val="ListParagraph"/>
-        <w:numPr>
-          <w:ilvl w:val="0"/>
-          <w:numId w:val="1"/>
-        </w:numPr>
-        <w:spacing w:after="80"/>
-      </w:pPr>
-      <w:r>
-        <w:t xml:space="preserve">3-bosqich: Wishlist, sharhlar, asillik sertifikati, statistika, Google/Apple kirish.</w:t>
+        <w:t xml:space="preserve">8. Qo'shimcha talablar va tuzatishlar</w:t>
+      </w:r>
+    </w:p>
+    <w:p>
+      <w:pPr>
+        <w:spacing w:after="120"/>
+      </w:pPr>
+      <w:r>
+        <w:t xml:space="preserve">Eslatma: hozirgi dizayn namunasi (canvas/artifact) statik maket — u faqat ko'rinishni ko'rsatadi, ma'lumotlar bazasi, fayl yuklash yoki forma yuborish kabi funksiyalar unda ishlamaydi. Quyidagi talablar Antigravity haqiqiy saytni (baza, backend, fayl saqlash bilan) qurayotganda amalga oshiriladi.</w:t>
+      </w:r>
+    </w:p>
+    <w:p>
+      <w:pPr>
+        <w:spacing w:after="80" w:before="200"/>
+      </w:pPr>
+      <w:r>
+        <w:rPr>
+          <w:b/>
+          <w:bCs/>
+          <w:color w:val="BA4E25"/>
+        </w:rPr>
+        <w:t xml:space="preserve">8.1. Admin panelga kirish cheklovi</w:t>
+      </w:r>
+    </w:p>
+    <w:p>
+      <w:pPr>
+        <w:pStyle w:val="ListParagraph"/>
+        <w:numPr>
+          <w:ilvl w:val="0"/>
+          <w:numId w:val="1"/>
+        </w:numPr>
+        <w:spacing w:after="80"/>
+      </w:pPr>
+      <w:r>
+        <w:t xml:space="preserve">Admin panel (/admin va uning barcha ichki sahifalari) ommaviy foydalanuvchilarga umuman ko'rinmasligi va ochilmasligi kerak.</w:t>
+      </w:r>
+    </w:p>
+    <w:p>
+      <w:pPr>
+        <w:pStyle w:val="ListParagraph"/>
+        <w:numPr>
+          <w:ilvl w:val="0"/>
+          <w:numId w:val="1"/>
+        </w:numPr>
+        <w:spacing w:after="80"/>
+      </w:pPr>
+      <w:r>
+        <w:t xml:space="preserve">Faqat "admin" rolidagi, tizimga kirgan foydalanuvchi kira oladi (NextAuth session + role tekshiruvi — middleware orqali). Boshqa hech kim to'g'ridan-to'g'ri link orqali ham kira olmasin — sessiya yo'q bo'lsa yoki role mos kelmasa, login sahifasiga yo'naltirilsin.</w:t>
+      </w:r>
+    </w:p>
+    <w:p>
+      <w:pPr>
+        <w:pStyle w:val="ListParagraph"/>
+        <w:numPr>
+          <w:ilvl w:val="0"/>
+          <w:numId w:val="1"/>
+        </w:numPr>
+        <w:spacing w:after="80"/>
+      </w:pPr>
+      <w:r>
+        <w:t xml:space="preserve">Admin login — oddiy mijozlar signup/signin formasidan alohida, mahalliy /admin/login sahifasi orqali (email + parol, alohida admin foydalanuvchi jadvalida yoki users jadvalida role="admin" ustuni bilan).</w:t>
+      </w:r>
+    </w:p>
+    <w:p>
+      <w:pPr>
+        <w:spacing w:after="80" w:before="200"/>
+      </w:pPr>
+      <w:r>
+        <w:rPr>
+          <w:b/>
+          <w:bCs/>
+          <w:color w:val="BA4E25"/>
+        </w:rPr>
+        <w:t xml:space="preserve">8.2. Kartinalar (Paintings) bo'limi</w:t>
+      </w:r>
+    </w:p>
+    <w:p>
+      <w:pPr>
+        <w:pStyle w:val="ListParagraph"/>
+        <w:numPr>
+          <w:ilvl w:val="0"/>
+          <w:numId w:val="1"/>
+        </w:numPr>
+        <w:spacing w:after="80"/>
+      </w:pPr>
+      <w:r>
+        <w:t xml:space="preserve">Kartina qo'shish/tahrirlash formasida rassom va kategoriya tanlov ro'yxatlarining o'zidan turib yangi rassom/kategoriya qo'shish imkoniyati bo'lsin ("+ Yangi rassom qo'shish" / "+ Yangi kategoriya qo'shish" — kichik oyna/modal orqali, sahifadan chiqmasdan).</w:t>
+      </w:r>
+    </w:p>
+    <w:p>
+      <w:pPr>
+        <w:pStyle w:val="ListParagraph"/>
+        <w:numPr>
+          <w:ilvl w:val="0"/>
+          <w:numId w:val="1"/>
+        </w:numPr>
+        <w:spacing w:after="80"/>
+      </w:pPr>
+      <w:r>
+        <w:t xml:space="preserve">O'lcham (size) maydoni erkin matn emas, tuzilgan (structured) input bo'lsin: eni va bo'yi uchun alohida son maydonlari + o'lchov birligi tanlovi (sm / dyum). Faqat raqam kiritishga ruxsat berilsin, natija saytda bir xil formatda ko'rsatilsin (masalan "60 × 90 sm").</w:t>
+      </w:r>
+    </w:p>
+    <w:p>
+      <w:pPr>
+        <w:pStyle w:val="ListParagraph"/>
+        <w:numPr>
+          <w:ilvl w:val="0"/>
+          <w:numId w:val="1"/>
+        </w:numPr>
+        <w:spacing w:after="80"/>
+      </w:pPr>
+      <w:r>
+        <w:t xml:space="preserve">Rasm yuklash — real backend (fayl saqlash xizmati: Cloudinary yoki Vercel Blob) ulanganidan keyin ishlaydi; hozirgi statik maketda bu funksiya faol emas.</w:t>
+      </w:r>
+    </w:p>
+    <w:p>
+      <w:pPr>
+        <w:spacing w:after="80" w:before="200"/>
+      </w:pPr>
+      <w:r>
+        <w:rPr>
+          <w:b/>
+          <w:bCs/>
+          <w:color w:val="BA4E25"/>
+        </w:rPr>
+        <w:t xml:space="preserve">8.3. Rassomlar va kategoriyalar bo'limlari</w:t>
+      </w:r>
+    </w:p>
+    <w:p>
+      <w:pPr>
+        <w:pStyle w:val="ListParagraph"/>
+        <w:numPr>
+          <w:ilvl w:val="0"/>
+          <w:numId w:val="1"/>
+        </w:numPr>
+        <w:spacing w:after="80"/>
+      </w:pPr>
+      <w:r>
+        <w:t xml:space="preserve">"Artists" va "Categories" bo'limlaridagi "Qo'shish" tugmalari ham xuddi shunday — ma'lumotlar bazasi ulanganidan keyin real ishlaydi (hozircha statik maket).</w:t>
+      </w:r>
+    </w:p>
+    <w:p>
+      <w:pPr>
+        <w:spacing w:after="80" w:before="200"/>
+      </w:pPr>
+      <w:r>
+        <w:rPr>
+          <w:b/>
+          <w:bCs/>
+          <w:color w:val="BA4E25"/>
+        </w:rPr>
+        <w:t xml:space="preserve">8.4. Inquiries va Service Requests farqi</w:t>
+      </w:r>
+    </w:p>
+    <w:p>
+      <w:pPr>
+        <w:pStyle w:val="ListParagraph"/>
+        <w:numPr>
+          <w:ilvl w:val="0"/>
+          <w:numId w:val="1"/>
+        </w:numPr>
+        <w:spacing w:after="80"/>
+      </w:pPr>
+      <w:r>
+        <w:t xml:space="preserve">Inquiries — mijoz saytdagi MAVJUD bitta kartina haqida savol/xarid qilish niyatida yuborgan so'rov (Gallery yoki kartina sahifasidagi "Inquire" tugmasi orqali). Har doim biror kartinaga bog'langan bo'ladi.</w:t>
+      </w:r>
+    </w:p>
+    <w:p>
+      <w:pPr>
+        <w:pStyle w:val="ListParagraph"/>
+        <w:numPr>
+          <w:ilvl w:val="0"/>
+          <w:numId w:val="1"/>
+        </w:numPr>
+        <w:spacing w:after="80"/>
+      </w:pPr>
+      <w:r>
+        <w:t xml:space="preserve">Service Requests — mijoz YANGI xizmat (mural, keramika, buyurtma bo'yicha rasm) uchun yuborgan so'rov, biror mavjud kartinaga bog'liq emas (Services sahifasidagi forma orqali). Loyihaning tavsifi, o'lchami, joylashuvi kabi boshqa maydonlar bo'ladi.</w:t>
+      </w:r>
+    </w:p>
+    <w:p>
+      <w:pPr>
+        <w:pStyle w:val="ListParagraph"/>
+        <w:numPr>
+          <w:ilvl w:val="0"/>
+          <w:numId w:val="1"/>
+        </w:numPr>
+        <w:spacing w:after="80"/>
+      </w:pPr>
+      <w:r>
+        <w:t xml:space="preserve">Shu farq sababli ular bazada alohida jadval (inquiries / service_requests) va admin panelda alohida bo'lim sifatida saqlanadi.</w:t>
+      </w:r>
+    </w:p>
+    <w:p>
+      <w:pPr>
+        <w:spacing w:after="80" w:before="200"/>
+      </w:pPr>
+      <w:r>
+        <w:rPr>
+          <w:b/>
+          <w:bCs/>
+          <w:color w:val="BA4E25"/>
+        </w:rPr>
+        <w:t xml:space="preserve">8.5. Valyuta kurslari</w:t>
+      </w:r>
+    </w:p>
+    <w:p>
+      <w:pPr>
+        <w:pStyle w:val="ListParagraph"/>
+        <w:numPr>
+          <w:ilvl w:val="0"/>
+          <w:numId w:val="1"/>
+        </w:numPr>
+        <w:spacing w:after="80"/>
+      </w:pPr>
+      <w:r>
+        <w:t xml:space="preserve">USD, EUR, RUB kurslari O'zbekiston Respublikasi Markaziy banki (cbu.uz) rasmiy API'sidan (masalan https://cbu.uz/oz/arkhiv-kursov-valyut/json/) avtomatik, kuniga bir marta yangilanib turadi.</w:t>
+      </w:r>
+    </w:p>
+    <w:p>
+      <w:pPr>
+        <w:pStyle w:val="ListParagraph"/>
+        <w:numPr>
+          <w:ilvl w:val="0"/>
+          <w:numId w:val="1"/>
+        </w:numPr>
+        <w:spacing w:after="80"/>
+      </w:pPr>
+      <w:r>
+        <w:t xml:space="preserve">Shu bilan birga, Settings bo'limida har bir valyuta kursini qo'lda kiritish/tuzatish imkoniyati ham qoldiriladi (avtomatik yangilanish ishlamay qolgan holatlar uchun yoki admin o'zi boshqacha kurs qo'yishni xohlasa).</w:t>
+      </w:r>
+    </w:p>
+    <w:p>
+      <w:pPr>
+        <w:spacing w:after="80" w:before="200"/>
+      </w:pPr>
+      <w:r>
+        <w:rPr>
+          <w:b/>
+          <w:bCs/>
+          <w:color w:val="BA4E25"/>
+        </w:rPr>
+        <w:t xml:space="preserve">8.6. Settings bo'limiga qo'shimcha maydonlar</w:t>
+      </w:r>
+    </w:p>
+    <w:p>
+      <w:pPr>
+        <w:pStyle w:val="ListParagraph"/>
+        <w:numPr>
+          <w:ilvl w:val="0"/>
+          <w:numId w:val="1"/>
+        </w:numPr>
+        <w:spacing w:after="80"/>
+      </w:pPr>
+      <w:r>
+        <w:t xml:space="preserve">Galereya nomi, telefon raqami, manzil (matn), joylashuv (xarita uchun lokatsiya/koordinata yoki Google Maps havolasi), ish vaqti, ijtimoiy tarmoqlar (Telegram, Instagram) va "Biz haqimizda" matni (uch tilda) — barchasi Settings bo'limidan tahrirlanadigan bo'lsin.</w:t>
+      </w:r>
+    </w:p>
+    <w:p>
+      <w:pPr>
+        <w:spacing w:after="80" w:before="200"/>
+      </w:pPr>
+      <w:r>
+        <w:rPr>
+          <w:b/>
+          <w:bCs/>
+          <w:color w:val="BA4E25"/>
+        </w:rPr>
+        <w:t xml:space="preserve">8.7. Ro'yxatdan o'tishda davlat tanlovi</w:t>
+      </w:r>
+    </w:p>
+    <w:p>
+      <w:pPr>
+        <w:pStyle w:val="ListParagraph"/>
+        <w:numPr>
+          <w:ilvl w:val="0"/>
+          <w:numId w:val="1"/>
+        </w:numPr>
+        <w:spacing w:after="80"/>
+      </w:pPr>
+      <w:r>
+        <w:t xml:space="preserve">Sign up formasidagi "Davlat" maydonida dunyodagi barcha davlatlar ro'yxati chiqarilsin (to'liq ISO davlatlar ro'yxati), cheklangan tanlov emas.</w:t>
+      </w:r>
+    </w:p>
+    <w:p>
+      <w:pPr>
+        <w:spacing w:after="80" w:before="200"/>
+      </w:pPr>
+      <w:r>
+        <w:rPr>
+          <w:b/>
+          <w:bCs/>
+          <w:color w:val="BA4E25"/>
+        </w:rPr>
+        <w:t xml:space="preserve">8.8. Parol tekshiruvi</w:t>
+      </w:r>
+    </w:p>
+    <w:p>
+      <w:pPr>
+        <w:pStyle w:val="ListParagraph"/>
+        <w:numPr>
+          <w:ilvl w:val="0"/>
+          <w:numId w:val="1"/>
+        </w:numPr>
+        <w:spacing w:after="80"/>
+      </w:pPr>
+      <w:r>
+        <w:t xml:space="preserve">Sign up formasida parol ikki marta kiritiladi (parol + parolni tasdiqlash), ikkisi bir xil bo'lishi tekshiriladi.</w:t>
+      </w:r>
+    </w:p>
+    <w:p>
+      <w:pPr>
+        <w:pStyle w:val="ListParagraph"/>
+        <w:numPr>
+          <w:ilvl w:val="0"/>
+          <w:numId w:val="1"/>
+        </w:numPr>
+        <w:spacing w:after="80"/>
+      </w:pPr>
+      <w:r>
+        <w:t xml:space="preserve">Parol kamida 8 belgidan iborat bo'lishi, kamida bitta katta harf va kamida bitta raqam o'z ichiga olishi shart — real vaqtda (foydalanuvchi yozayotganda) tekshirilib, mos kelmasa xato xabari ko'rsatilsin.</w:t>
+      </w:r>
+    </w:p>
+    <w:p>
+      <w:pPr>
+        <w:spacing w:after="80" w:before="200"/>
+      </w:pPr>
+      <w:r>
+        <w:rPr>
+          <w:b/>
+          <w:bCs/>
+          <w:color w:val="BA4E25"/>
+        </w:rPr>
+        <w:t xml:space="preserve">8.9. Bosh sahifadagi asosiy rasm</w:t>
+      </w:r>
+    </w:p>
+    <w:p>
+      <w:pPr>
+        <w:pStyle w:val="ListParagraph"/>
+        <w:numPr>
+          <w:ilvl w:val="0"/>
+          <w:numId w:val="1"/>
+        </w:numPr>
+        <w:spacing w:after="80"/>
+      </w:pPr>
+      <w:r>
+        <w:t xml:space="preserve">Bosh sahifaning hero qismidagi asosiy rasm bir nechta rasm orasida avtomatik almashinib turadigan (carousel/slideshow) qilib qo'yiladi — statik bitta rasm o'rniga.</w:t>
+      </w:r>
+    </w:p>
+    <w:p>
+      <w:pPr>
+        <w:pStyle w:val="Heading1"/>
+        <w:spacing w:after="200" w:before="400"/>
+      </w:pPr>
+      <w:r>
+        <w:t xml:space="preserve">9. Ishga tushirish tartibi (tavsiya)</w:t>
+      </w:r>
+    </w:p>
+    <w:p>
+      <w:pPr>
+        <w:pStyle w:val="ListParagraph"/>
+        <w:numPr>
+          <w:ilvl w:val="0"/>
+          <w:numId w:val="1"/>
+        </w:numPr>
+        <w:spacing w:after="80"/>
+      </w:pPr>
+      <w:r>
+        <w:t xml:space="preserve">1-bosqich: Kartinalar, rassomlar, kategoriyalar, galereya va kontakt sahifalari + admin panelning asosiy qismi (shu jumladan admin kirish cheklovi, real fayl yuklash, inline artist/category qo'shish).</w:t>
+      </w:r>
+    </w:p>
+    <w:p>
+      <w:pPr>
+        <w:pStyle w:val="ListParagraph"/>
+        <w:numPr>
+          <w:ilvl w:val="0"/>
+          <w:numId w:val="1"/>
+        </w:numPr>
+        <w:spacing w:after="80"/>
+      </w:pPr>
+      <w:r>
+        <w:t xml:space="preserve">2-bosqich: Ro'yxatdan o'tish (davlat ro'yxati, parol tekshiruvi), so'rov/buyurtma tizimi, narx-skidka tizimi.</w:t>
+      </w:r>
+    </w:p>
+    <w:p>
+      <w:pPr>
+        <w:pStyle w:val="ListParagraph"/>
+        <w:numPr>
+          <w:ilvl w:val="0"/>
+          <w:numId w:val="1"/>
+        </w:numPr>
+        <w:spacing w:after="80"/>
+      </w:pPr>
+      <w:r>
+        <w:t xml:space="preserve">3-bosqich: Wishlist, sharhlar, asillik sertifikati, statistika, Google/Apple kirish, valyuta kurslari avtomatizatsiyasi, Settings kengaytmasi, bosh sahifa rasm carousel'i.</w:t>
       </w:r>
     </w:p>
     <w:sectPr>

</xml_diff>

<commit_message>
Fix settings multiple phones & timepicker, contact messages flow, i18n, auto slug, and inquiry replies
</commit_message>
<xml_diff>
--- a/TZ/ArtQala_TZ.docx
+++ b/TZ/ArtQala_TZ.docx
@@ -2788,6 +2788,123 @@
     </w:p>
     <w:p>
       <w:pPr>
+        <w:spacing w:after="80" w:before="200"/>
+      </w:pPr>
+      <w:r>
+        <w:rPr>
+          <w:b/>
+          <w:bCs/>
+          <w:color w:val="BA4E25"/>
+        </w:rPr>
+        <w:t xml:space="preserve">8.10. Sotuvlar va to'lov jarayoni</w:t>
+      </w:r>
+    </w:p>
+    <w:p>
+      <w:pPr>
+        <w:pStyle w:val="ListParagraph"/>
+        <w:numPr>
+          <w:ilvl w:val="0"/>
+          <w:numId w:val="1"/>
+        </w:numPr>
+        <w:spacing w:after="80"/>
+      </w:pPr>
+      <w:r>
+        <w:t xml:space="preserve">Saytda to'g'ridan-to'g'ri onlayn checkout (kartadan avtomatik pul yechish) BO'LMAYDI — bu original, yagona nusxadagi san'at asarlari sotiladigan galereyalar uchun odatiy amaliyot: har bir buyurtma alohida kelishuv talab qiladi (yetkazib berish, sug'urta, asillik tekshiruvi).</w:t>
+      </w:r>
+    </w:p>
+    <w:p>
+      <w:pPr>
+        <w:pStyle w:val="ListParagraph"/>
+        <w:numPr>
+          <w:ilvl w:val="0"/>
+          <w:numId w:val="1"/>
+        </w:numPr>
+        <w:spacing w:after="80"/>
+      </w:pPr>
+      <w:r>
+        <w:t xml:space="preserve">Jarayon: mijoz "Inquire" tugmasi orqali so'rov yuboradi → admin panelda so'rov ko'rinadi → galereya xodimi mijoz bilan email/telefon orqali bog'lanadi, narx va yetkazib berish shartlarini kelishadi → to'lov bank o'tkazmasi (SWIFT — xorijiy mijozlar uchun), naqd yoki galereyada kartadan o'qitish orqali amalga oshiriladi → admin so'rov holatini "To'landi / Yuborildi / Yakunlandi" qilib belgilaydi.</w:t>
+      </w:r>
+    </w:p>
+    <w:p>
+      <w:pPr>
+        <w:pStyle w:val="ListParagraph"/>
+        <w:numPr>
+          <w:ilvl w:val="0"/>
+          <w:numId w:val="1"/>
+        </w:numPr>
+        <w:spacing w:after="80"/>
+      </w:pPr>
+      <w:r>
+        <w:t xml:space="preserve">Mahalliy mijozlar uchun keyinchalik Click yoki Payme integratsiyasi qo'shilishi mumkin (UZS kartalar uchun). Xorijiy mijozlarning xalqaro kartalari uchun esa Stripe kabi xizmatlar O'zbekistondan ro'yxatdan o'tgan tashkilotga to'g'ridan-to'g'ri ulanmaydi (tashqi kompaniya yoki Payoneer kabi oraliq yechim talab qiladi) — shu sabab hozirgi bosqichda onlayn xalqaro to'lov qo'shilmaydi, kelishuv asosidagi to'lov davom etadi.</w:t>
+      </w:r>
+    </w:p>
+    <w:p>
+      <w:pPr>
+        <w:spacing w:after="80" w:before="200"/>
+      </w:pPr>
+      <w:r>
+        <w:rPr>
+          <w:b/>
+          <w:bCs/>
+          <w:color w:val="BA4E25"/>
+        </w:rPr>
+        <w:t xml:space="preserve">8.11. Statistika va grafiklar (Dashboard)</w:t>
+      </w:r>
+    </w:p>
+    <w:p>
+      <w:pPr>
+        <w:pStyle w:val="ListParagraph"/>
+        <w:numPr>
+          <w:ilvl w:val="0"/>
+          <w:numId w:val="1"/>
+        </w:numPr>
+        <w:spacing w:after="80"/>
+      </w:pPr>
+      <w:r>
+        <w:t xml:space="preserve">Admin panelning Dashboard bo'limida kunlik / haftalik / oylik tushum, tashriflar (visits) va ko'rishlar (views) sonini grafik (chart) ko'rinishida ko'rsatish kerak — vaqt oralig'ini almashtirish imkoniyati bilan.</w:t>
+      </w:r>
+    </w:p>
+    <w:p>
+      <w:pPr>
+        <w:pStyle w:val="ListParagraph"/>
+        <w:numPr>
+          <w:ilvl w:val="0"/>
+          <w:numId w:val="1"/>
+        </w:numPr>
+        <w:spacing w:after="80"/>
+      </w:pPr>
+      <w:r>
+        <w:t xml:space="preserve">Qaysi kategoriya (masalan Tarixiy obidalar, Portretlar va h.k.) ko'proq qiziqish uyg'otayotgani — kategoriyalar bo'yicha ko'rishlar/so'rovlar sonini solishtiruvchi grafik.</w:t>
+      </w:r>
+    </w:p>
+    <w:p>
+      <w:pPr>
+        <w:pStyle w:val="ListParagraph"/>
+        <w:numPr>
+          <w:ilvl w:val="0"/>
+          <w:numId w:val="1"/>
+        </w:numPr>
+        <w:spacing w:after="80"/>
+      </w:pPr>
+      <w:r>
+        <w:t xml:space="preserve">Qaysi rassomning ishlariga ko'proq qiziqish borligi — rassomlar bo'yicha ko'rishlar/so'rovlar/sotuvlar sonini solishtiruvchi grafik.</w:t>
+      </w:r>
+    </w:p>
+    <w:p>
+      <w:pPr>
+        <w:pStyle w:val="ListParagraph"/>
+        <w:numPr>
+          <w:ilvl w:val="0"/>
+          <w:numId w:val="1"/>
+        </w:numPr>
+        <w:spacing w:after="80"/>
+      </w:pPr>
+      <w:r>
+        <w:t xml:space="preserve">Grafiklar uchun tavsiya etilgan kutubxona: Recharts (React bilan mos, sodda va yengil).</w:t>
+      </w:r>
+    </w:p>
+    <w:p>
+      <w:pPr>
         <w:pStyle w:val="Heading1"/>
         <w:spacing w:after="200" w:before="400"/>
       </w:pPr>
@@ -2832,6 +2949,335 @@
       </w:pPr>
       <w:r>
         <w:t xml:space="preserve">3-bosqich: Wishlist, sharhlar, asillik sertifikati, statistika, Google/Apple kirish, valyuta kurslari avtomatizatsiyasi, Settings kengaytmasi, bosh sahifa rasm carousel'i.</w:t>
+      </w:r>
+    </w:p>
+    <w:p>
+      <w:pPr>
+        <w:pStyle w:val="Heading1"/>
+        <w:spacing w:after="200" w:before="400"/>
+      </w:pPr>
+      <w:r>
+        <w:t xml:space="preserve">10. Ishga tushirishdan oldingi tekshiruv ro'yxati</w:t>
+      </w:r>
+    </w:p>
+    <w:p>
+      <w:pPr>
+        <w:spacing w:after="120"/>
+      </w:pPr>
+      <w:r>
+        <w:t xml:space="preserve">Sayt jamoatchilikka ochilishidan oldin quyidagilar bajarilgan/tekshirilgan bo'lishi kerak.</w:t>
+      </w:r>
+    </w:p>
+    <w:p>
+      <w:pPr>
+        <w:spacing w:after="80" w:before="200"/>
+      </w:pPr>
+      <w:r>
+        <w:rPr>
+          <w:b/>
+          <w:bCs/>
+          <w:color w:val="BA4E25"/>
+        </w:rPr>
+        <w:t xml:space="preserve">Huquqiy va xavfsizlik</w:t>
+      </w:r>
+    </w:p>
+    <w:p>
+      <w:pPr>
+        <w:pStyle w:val="ListParagraph"/>
+        <w:numPr>
+          <w:ilvl w:val="0"/>
+          <w:numId w:val="1"/>
+        </w:numPr>
+        <w:spacing w:after="80"/>
+      </w:pPr>
+      <w:r>
+        <w:t xml:space="preserve">Privacy Policy va Terms &amp; Conditions sahifalari nashr etilgan (TZ bo'lim 2'da bor).</w:t>
+      </w:r>
+    </w:p>
+    <w:p>
+      <w:pPr>
+        <w:pStyle w:val="ListParagraph"/>
+        <w:numPr>
+          <w:ilvl w:val="0"/>
+          <w:numId w:val="1"/>
+        </w:numPr>
+        <w:spacing w:after="80"/>
+      </w:pPr>
+      <w:r>
+        <w:t xml:space="preserve">Barcha maxfiy ma'lumotlar (DB parol, API kalitlar, OAuth secret'lar) faqat server tomonida (.env orqali) saqlanadi — frontend kodida yoki brauzerga yuboriladigan javoblarda umuman ko'rinmaydi.</w:t>
+      </w:r>
+    </w:p>
+    <w:p>
+      <w:pPr>
+        <w:pStyle w:val="ListParagraph"/>
+        <w:numPr>
+          <w:ilvl w:val="0"/>
+          <w:numId w:val="1"/>
+        </w:numPr>
+        <w:spacing w:after="80"/>
+      </w:pPr>
+      <w:r>
+        <w:t xml:space="preserve">HTTPS majburiy — Vercel'ga deploy qilinganda avtomatik ta'minlanadi, alohida sozlash shart emas.</w:t>
+      </w:r>
+    </w:p>
+    <w:p>
+      <w:pPr>
+        <w:pStyle w:val="ListParagraph"/>
+        <w:numPr>
+          <w:ilvl w:val="0"/>
+          <w:numId w:val="1"/>
+        </w:numPr>
+        <w:spacing w:after="80"/>
+      </w:pPr>
+      <w:r>
+        <w:t xml:space="preserve">Agar EU/xorijiy tashrifchilar uchun cookie/wishlist local storage ishlatilsa — kichik cookie/maxfiylik bildirishnomasi (banner) qo'yiladi.</w:t>
+      </w:r>
+    </w:p>
+    <w:p>
+      <w:pPr>
+        <w:spacing w:after="80" w:before="200"/>
+      </w:pPr>
+      <w:r>
+        <w:rPr>
+          <w:b/>
+          <w:bCs/>
+          <w:color w:val="BA4E25"/>
+        </w:rPr>
+        <w:t xml:space="preserve">SEO va ijtimoiy tarmoqlar</w:t>
+      </w:r>
+    </w:p>
+    <w:p>
+      <w:pPr>
+        <w:pStyle w:val="ListParagraph"/>
+        <w:numPr>
+          <w:ilvl w:val="0"/>
+          <w:numId w:val="1"/>
+        </w:numPr>
+        <w:spacing w:after="80"/>
+      </w:pPr>
+      <w:r>
+        <w:t xml:space="preserve">Har bir sahifa uchun mos meta title va description (uch tilda).</w:t>
+      </w:r>
+    </w:p>
+    <w:p>
+      <w:pPr>
+        <w:pStyle w:val="ListParagraph"/>
+        <w:numPr>
+          <w:ilvl w:val="0"/>
+          <w:numId w:val="1"/>
+        </w:numPr>
+        <w:spacing w:after="80"/>
+      </w:pPr>
+      <w:r>
+        <w:t xml:space="preserve">Ijtimoiy tarmoqda havola tashlanganda chiroyli ko'rinishi uchun Open Graph rasm (social preview image) sozlangan.</w:t>
+      </w:r>
+    </w:p>
+    <w:p>
+      <w:pPr>
+        <w:pStyle w:val="ListParagraph"/>
+        <w:numPr>
+          <w:ilvl w:val="0"/>
+          <w:numId w:val="1"/>
+        </w:numPr>
+        <w:spacing w:after="80"/>
+      </w:pPr>
+      <w:r>
+        <w:t xml:space="preserve">Sayt favicon'i — mavjud logotip asosida.</w:t>
+      </w:r>
+    </w:p>
+    <w:p>
+      <w:pPr>
+        <w:pStyle w:val="ListParagraph"/>
+        <w:numPr>
+          <w:ilvl w:val="0"/>
+          <w:numId w:val="1"/>
+        </w:numPr>
+        <w:spacing w:after="80"/>
+      </w:pPr>
+      <w:r>
+        <w:t xml:space="preserve">sitemap.xml va robots.txt avtomatik generatsiya qilingan (Next.js buni o'zi qo'llab-quvvatlaydi).</w:t>
+      </w:r>
+    </w:p>
+    <w:p>
+      <w:pPr>
+        <w:pStyle w:val="ListParagraph"/>
+        <w:numPr>
+          <w:ilvl w:val="0"/>
+          <w:numId w:val="1"/>
+        </w:numPr>
+        <w:spacing w:after="80"/>
+      </w:pPr>
+      <w:r>
+        <w:t xml:space="preserve">Barcha kartina/rassom rasmlariga tavsiflovchi alt-matn (uch tilda) qo'yilgan — SEO va Google Images orqali topilish uchun.</w:t>
+      </w:r>
+    </w:p>
+    <w:p>
+      <w:pPr>
+        <w:spacing w:after="80" w:before="200"/>
+      </w:pPr>
+      <w:r>
+        <w:rPr>
+          <w:b/>
+          <w:bCs/>
+          <w:color w:val="BA4E25"/>
+        </w:rPr>
+        <w:t xml:space="preserve">Tezlik va ko'rinish</w:t>
+      </w:r>
+    </w:p>
+    <w:p>
+      <w:pPr>
+        <w:pStyle w:val="ListParagraph"/>
+        <w:numPr>
+          <w:ilvl w:val="0"/>
+          <w:numId w:val="1"/>
+        </w:numPr>
+        <w:spacing w:after="80"/>
+      </w:pPr>
+      <w:r>
+        <w:t xml:space="preserve">Barcha rasmlar siqilgan (compress) va zamonaviy formatda (masalan WebP) xizmat qiladi — kartina rasmlari og'ir bo'lib, sahifa sekin ochilib qolmasligi uchun.</w:t>
+      </w:r>
+    </w:p>
+    <w:p>
+      <w:pPr>
+        <w:pStyle w:val="ListParagraph"/>
+        <w:numPr>
+          <w:ilvl w:val="0"/>
+          <w:numId w:val="1"/>
+        </w:numPr>
+        <w:spacing w:after="80"/>
+      </w:pPr>
+      <w:r>
+        <w:t xml:space="preserve">Sahifa yuklanish tezligi tekshirilgan (Lighthouse yoki shunga o'xshash vosita bilan).</w:t>
+      </w:r>
+    </w:p>
+    <w:p>
+      <w:pPr>
+        <w:pStyle w:val="ListParagraph"/>
+        <w:numPr>
+          <w:ilvl w:val="0"/>
+          <w:numId w:val="1"/>
+        </w:numPr>
+        <w:spacing w:after="80"/>
+      </w:pPr>
+      <w:r>
+        <w:t xml:space="preserve">Rang kontrasti (matn/fon) o'qish uchun yetarli — ayniqsa tungi hero bo'limida.</w:t>
+      </w:r>
+    </w:p>
+    <w:p>
+      <w:pPr>
+        <w:pStyle w:val="ListParagraph"/>
+        <w:numPr>
+          <w:ilvl w:val="0"/>
+          <w:numId w:val="1"/>
+        </w:numPr>
+        <w:spacing w:after="80"/>
+      </w:pPr>
+      <w:r>
+        <w:t xml:space="preserve">Sayt to'liq mobil-moslashgan (responsive) — asosiy auditoriya (sayyohlar) telefondan kirishi ehtimoli yuqori.</w:t>
+      </w:r>
+    </w:p>
+    <w:p>
+      <w:pPr>
+        <w:pStyle w:val="ListParagraph"/>
+        <w:numPr>
+          <w:ilvl w:val="0"/>
+          <w:numId w:val="1"/>
+        </w:numPr>
+        <w:spacing w:after="80"/>
+      </w:pPr>
+      <w:r>
+        <w:t xml:space="preserve">Maxsus 404 (topilmadi) sahifasi — sayt uslubiga mos dizaynda.</w:t>
+      </w:r>
+    </w:p>
+    <w:p>
+      <w:pPr>
+        <w:pStyle w:val="ListParagraph"/>
+        <w:numPr>
+          <w:ilvl w:val="0"/>
+          <w:numId w:val="1"/>
+        </w:numPr>
+        <w:spacing w:after="80"/>
+      </w:pPr>
+      <w:r>
+        <w:t xml:space="preserve">Barcha ichki havolalar tekshirilgan, buzilgan (404 beruvchi) havola qolmagan.</w:t>
+      </w:r>
+    </w:p>
+    <w:p>
+      <w:pPr>
+        <w:spacing w:after="80" w:before="200"/>
+      </w:pPr>
+      <w:r>
+        <w:rPr>
+          <w:b/>
+          <w:bCs/>
+          <w:color w:val="BA4E25"/>
+        </w:rPr>
+        <w:t xml:space="preserve">Formalar va xavfsizlik</w:t>
+      </w:r>
+    </w:p>
+    <w:p>
+      <w:pPr>
+        <w:pStyle w:val="ListParagraph"/>
+        <w:numPr>
+          <w:ilvl w:val="0"/>
+          <w:numId w:val="1"/>
+        </w:numPr>
+        <w:spacing w:after="80"/>
+      </w:pPr>
+      <w:r>
+        <w:t xml:space="preserve">Barcha formalar (signup, contact, inquiry, service request) to'liq validatsiya qilinadi (majburiy maydonlar, email formati, telefon formati va h.k.).</w:t>
+      </w:r>
+    </w:p>
+    <w:p>
+      <w:pPr>
+        <w:pStyle w:val="ListParagraph"/>
+        <w:numPr>
+          <w:ilvl w:val="0"/>
+          <w:numId w:val="1"/>
+        </w:numPr>
+        <w:spacing w:after="80"/>
+      </w:pPr>
+      <w:r>
+        <w:t xml:space="preserve">Ommaviy formalarda (Contact, Inquiry, Service Request) spam-himoya (masalan reCAPTCHA yoki oddiy rate-limiting) o'rnatilgan — bot orqali keladigan keraksiz xabarlarning oldini olish uchun.</w:t>
+      </w:r>
+    </w:p>
+    <w:p>
+      <w:pPr>
+        <w:spacing w:after="80" w:before="200"/>
+      </w:pPr>
+      <w:r>
+        <w:rPr>
+          <w:b/>
+          <w:bCs/>
+          <w:color w:val="BA4E25"/>
+        </w:rPr>
+        <w:t xml:space="preserve">Foydalanuvchi tajribasi</w:t>
+      </w:r>
+    </w:p>
+    <w:p>
+      <w:pPr>
+        <w:pStyle w:val="ListParagraph"/>
+        <w:numPr>
+          <w:ilvl w:val="0"/>
+          <w:numId w:val="1"/>
+        </w:numPr>
+        <w:spacing w:after="80"/>
+      </w:pPr>
+      <w:r>
+        <w:t xml:space="preserve">Google Analytics (yoki shunga o'xshash tashqi analitika) ulangan — admin paneldagi ichki statistikaga qo'shimcha, tashqi manbalardan (Google, ijtimoiy tarmoqlar) qancha tashrif kelayotganini ko'rish uchun.</w:t>
+      </w:r>
+    </w:p>
+    <w:p>
+      <w:pPr>
+        <w:pStyle w:val="ListParagraph"/>
+        <w:numPr>
+          <w:ilvl w:val="0"/>
+          <w:numId w:val="1"/>
+        </w:numPr>
+        <w:spacing w:after="80"/>
+      </w:pPr>
+      <w:r>
+        <w:t xml:space="preserve">Har bir sahifada bitta aniq maqsadli harakat (call-to-action) bor — masalan bosh sahifada "Galereyani ko'rish", kartina sahifasida "So'rov yuborish".</w:t>
       </w:r>
     </w:p>
     <w:sectPr>

</xml_diff>

<commit_message>
feat: implement section 8.11 statistics and interactive charts with Recharts
</commit_message>
<xml_diff>
--- a/TZ/ArtQala_TZ.docx
+++ b/TZ/ArtQala_TZ.docx
@@ -536,7 +536,20 @@
         <w:spacing w:after="80"/>
       </w:pPr>
       <w:r>
-        <w:t xml:space="preserve">Yuborilgan so'rovlar/buyurtmalar holati ("ko'rib chiqilmoqda / javob berildi / yakunlandi").</w:t>
+        <w:t xml:space="preserve">"Mening so'rovlarim" bo'limi — yuborilgan har bir so'rov (inquiry/service request) alohida karta/sahifa sifatida, holati ("ko'rib chiqilmoqda / javob berildi / yakunlandi") va TO'LIQ YOZISHMA (o'zi yozgan xabar + admin javoblari, chat ko'rinishida, xronologik tartibda) bilan.</w:t>
+      </w:r>
+    </w:p>
+    <w:p>
+      <w:pPr>
+        <w:pStyle w:val="ListParagraph"/>
+        <w:numPr>
+          <w:ilvl w:val="0"/>
+          <w:numId w:val="1"/>
+        </w:numPr>
+        <w:spacing w:after="80"/>
+      </w:pPr>
+      <w:r>
+        <w:t xml:space="preserve">Mijoz shu yerdan turib admin javobiga qo'shimcha savol/xabar yozib, suhbatni davom ettirishi ham mumkin (bir martalik javob emas, ketma-ket yozishma).</w:t>
       </w:r>
     </w:p>
     <w:p>
@@ -1518,7 +1531,7 @@
                 <w:sz w:val="20"/>
                 <w:szCs w:val="20"/>
               </w:rPr>
-              <w:t xml:space="preserve">id, user_id, painting_id, status, message, created_at</w:t>
+              <w:t xml:space="preserve">id, user_id, painting_id, status, created_at</w:t>
             </w:r>
           </w:p>
         </w:tc>
@@ -1542,7 +1555,7 @@
                 <w:sz w:val="20"/>
                 <w:szCs w:val="20"/>
               </w:rPr>
-              <w:t xml:space="preserve">service_requests</w:t>
+              <w:t xml:space="preserve">inquiry_messages</w:t>
             </w:r>
           </w:p>
         </w:tc>
@@ -1564,7 +1577,7 @@
                 <w:sz w:val="20"/>
                 <w:szCs w:val="20"/>
               </w:rPr>
-              <w:t xml:space="preserve">id, user_id, service_type (mural/ceramics/custom), description, status, created_at</w:t>
+              <w:t xml:space="preserve">id, inquiry_id, sender (customer/admin), message, created_at, is_read</w:t>
             </w:r>
           </w:p>
         </w:tc>
@@ -1588,7 +1601,7 @@
                 <w:sz w:val="20"/>
                 <w:szCs w:val="20"/>
               </w:rPr>
-              <w:t xml:space="preserve">reviews</w:t>
+              <w:t xml:space="preserve">service_requests</w:t>
             </w:r>
           </w:p>
         </w:tc>
@@ -1610,7 +1623,7 @@
                 <w:sz w:val="20"/>
                 <w:szCs w:val="20"/>
               </w:rPr>
-              <w:t xml:space="preserve">id, user_id, painting_id (nullable), rating, text, created_at</w:t>
+              <w:t xml:space="preserve">id, user_id, service_type (mural/ceramics/custom), description, status, created_at</w:t>
             </w:r>
           </w:p>
         </w:tc>
@@ -1634,6 +1647,98 @@
                 <w:sz w:val="20"/>
                 <w:szCs w:val="20"/>
               </w:rPr>
+              <w:t xml:space="preserve">service_request_messages</w:t>
+            </w:r>
+          </w:p>
+        </w:tc>
+        <w:tc>
+          <w:tcPr>
+            <w:tcW w:type="dxa" w:w="6750"/>
+            <w:tcMar>
+              <w:top w:type="dxa" w:w="80"/>
+              <w:left w:type="dxa" w:w="100"/>
+              <w:bottom w:type="dxa" w:w="80"/>
+              <w:right w:type="dxa" w:w="100"/>
+            </w:tcMar>
+          </w:tcPr>
+          <w:p>
+            <w:r>
+              <w:rPr>
+                <w:b w:val="false"/>
+                <w:bCs w:val="false"/>
+                <w:sz w:val="20"/>
+                <w:szCs w:val="20"/>
+              </w:rPr>
+              <w:t xml:space="preserve">id, service_request_id, sender (customer/admin), message, created_at, is_read</w:t>
+            </w:r>
+          </w:p>
+        </w:tc>
+      </w:tr>
+      <w:tr>
+        <w:tc>
+          <w:tcPr>
+            <w:tcW w:type="dxa" w:w="2600"/>
+            <w:tcMar>
+              <w:top w:type="dxa" w:w="80"/>
+              <w:left w:type="dxa" w:w="100"/>
+              <w:bottom w:type="dxa" w:w="80"/>
+              <w:right w:type="dxa" w:w="100"/>
+            </w:tcMar>
+          </w:tcPr>
+          <w:p>
+            <w:r>
+              <w:rPr>
+                <w:b w:val="false"/>
+                <w:bCs w:val="false"/>
+                <w:sz w:val="20"/>
+                <w:szCs w:val="20"/>
+              </w:rPr>
+              <w:t xml:space="preserve">reviews</w:t>
+            </w:r>
+          </w:p>
+        </w:tc>
+        <w:tc>
+          <w:tcPr>
+            <w:tcW w:type="dxa" w:w="6750"/>
+            <w:tcMar>
+              <w:top w:type="dxa" w:w="80"/>
+              <w:left w:type="dxa" w:w="100"/>
+              <w:bottom w:type="dxa" w:w="80"/>
+              <w:right w:type="dxa" w:w="100"/>
+            </w:tcMar>
+          </w:tcPr>
+          <w:p>
+            <w:r>
+              <w:rPr>
+                <w:b w:val="false"/>
+                <w:bCs w:val="false"/>
+                <w:sz w:val="20"/>
+                <w:szCs w:val="20"/>
+              </w:rPr>
+              <w:t xml:space="preserve">id, user_id, painting_id (nullable), rating, text, created_at</w:t>
+            </w:r>
+          </w:p>
+        </w:tc>
+      </w:tr>
+      <w:tr>
+        <w:tc>
+          <w:tcPr>
+            <w:tcW w:type="dxa" w:w="2600"/>
+            <w:tcMar>
+              <w:top w:type="dxa" w:w="80"/>
+              <w:left w:type="dxa" w:w="100"/>
+              <w:bottom w:type="dxa" w:w="80"/>
+              <w:right w:type="dxa" w:w="100"/>
+            </w:tcMar>
+          </w:tcPr>
+          <w:p>
+            <w:r>
+              <w:rPr>
+                <w:b w:val="false"/>
+                <w:bCs w:val="false"/>
+                <w:sz w:val="20"/>
+                <w:szCs w:val="20"/>
+              </w:rPr>
               <w:t xml:space="preserve">wishlist</w:t>
             </w:r>
           </w:p>
@@ -1662,6 +1767,14 @@
         </w:tc>
       </w:tr>
     </w:tbl>
+    <w:p>
+      <w:pPr>
+        <w:spacing w:after="120"/>
+      </w:pPr>
+      <w:r>
+        <w:t xml:space="preserve">Eslatma: inquiries va service_requests endi bitta "message" maydoni emas, balki alohida xabarlar jadvali (inquiry_messages / service_request_messages) orqali ishlaydi — bu mijoz va admin orasidagi to'liq yozishmani (chat kabi) saqlash imkonini beradi, faqat bitta savol-javob emas.</w:t>
+      </w:r>
+    </w:p>
     <w:p>
       <w:pPr>
         <w:pStyle w:val="Heading1"/>
@@ -2836,6 +2949,79 @@
       </w:pPr>
       <w:r>
         <w:t xml:space="preserve">Mahalliy mijozlar uchun keyinchalik Click yoki Payme integratsiyasi qo'shilishi mumkin (UZS kartalar uchun). Xorijiy mijozlarning xalqaro kartalari uchun esa Stripe kabi xizmatlar O'zbekistondan ro'yxatdan o'tgan tashkilotga to'g'ridan-to'g'ri ulanmaydi (tashqi kompaniya yoki Payoneer kabi oraliq yechim talab qiladi) — shu sabab hozirgi bosqichda onlayn xalqaro to'lov qo'shilmaydi, kelishuv asosidagi to'lov davom etadi.</w:t>
+      </w:r>
+    </w:p>
+    <w:p>
+      <w:pPr>
+        <w:spacing w:after="80" w:before="200"/>
+      </w:pPr>
+      <w:r>
+        <w:rPr>
+          <w:b/>
+          <w:bCs/>
+          <w:color w:val="BA4E25"/>
+        </w:rPr>
+        <w:t xml:space="preserve">8.11a. Inquiry/Service Request javoblari mijozga qanday yetib boradi</w:t>
+      </w:r>
+    </w:p>
+    <w:p>
+      <w:pPr>
+        <w:spacing w:after="120"/>
+      </w:pPr>
+      <w:r>
+        <w:t xml:space="preserve">Bu — "admin javob yozdi, lekin mijozga yetib bormayapti" muammosining aniq yechimi:</w:t>
+      </w:r>
+    </w:p>
+    <w:p>
+      <w:pPr>
+        <w:pStyle w:val="ListParagraph"/>
+        <w:numPr>
+          <w:ilvl w:val="0"/>
+          <w:numId w:val="1"/>
+        </w:numPr>
+        <w:spacing w:after="80"/>
+      </w:pPr>
+      <w:r>
+        <w:t xml:space="preserve">Har bir inquiry/service request — bitta savol-javob emas, balki xronologik YOZISHMA (thread): mijoz yozadi → admin javob beradi → mijoz yana yozishi mumkin → va h.k. (inquiry_messages / service_request_messages jadvali orqali).</w:t>
+      </w:r>
+    </w:p>
+    <w:p>
+      <w:pPr>
+        <w:pStyle w:val="ListParagraph"/>
+        <w:numPr>
+          <w:ilvl w:val="0"/>
+          <w:numId w:val="1"/>
+        </w:numPr>
+        <w:spacing w:after="80"/>
+      </w:pPr>
+      <w:r>
+        <w:t xml:space="preserve">Admin panelda javob yozilgan zahoti, ikkita narsa sodir bo'lishi kerak: (1) xabar bazaga saqlanadi va mijozning shaxsiy kabinetidagi "Mening so'rovlarim" bo'limida darrov ko'rinadi; (2) mijozning ro'yxatdan o'tishda bergan emailiga "Sizga Art Qala'dan javob keldi" mazmunidagi xat yuboriladi (Resend orqali), xatda tizimga kirib to'liq javobni o'qish uchun havola bo'ladi.</w:t>
+      </w:r>
+    </w:p>
+    <w:p>
+      <w:pPr>
+        <w:pStyle w:val="ListParagraph"/>
+        <w:numPr>
+          <w:ilvl w:val="0"/>
+          <w:numId w:val="1"/>
+        </w:numPr>
+        <w:spacing w:after="80"/>
+      </w:pPr>
+      <w:r>
+        <w:t xml:space="preserve">Mijoz o'zi tizimga kirib "Mening so'rovlarim" sahifasini ochganda — aynan shu joyda, o'zi yozgan xabari ostida adminning javobini chat ko'rinishida ko'radi.</w:t>
+      </w:r>
+    </w:p>
+    <w:p>
+      <w:pPr>
+        <w:pStyle w:val="ListParagraph"/>
+        <w:numPr>
+          <w:ilvl w:val="0"/>
+          <w:numId w:val="1"/>
+        </w:numPr>
+        <w:spacing w:after="80"/>
+      </w:pPr>
+      <w:r>
+        <w:t xml:space="preserve">Agar mijoz email orqali darhol bildirishnoma olishni xohlamasa ham, keyingi safar tizimga kirganda "Mening so'rovlarim" bo'limida o'qilmagan javoblar soni (badge) ko'rsatilishi kerak.</w:t>
       </w:r>
     </w:p>
     <w:p>

</xml_diff>